<commit_message>
Fix v1.21.0 audit/reference integrity: disable dead MR Table-3 cross-check (MR removed at v1.20.0), renumber references to strict Vancouver first-appearance order, regenerate BMC docx
</commit_message>
<xml_diff>
--- a/07_submission_bmc_v1.21.0/Manuscript.docx
+++ b/07_submission_bmc_v1.21.0/Manuscript.docx
@@ -998,7 +998,7 @@
           <w:b w:val="0"/>
           <w:i w:val="0"/>
         </w:rPr>
-        <w:t xml:space="preserve"> HAVCR2/TIM-3 expression, which is compatible with — but does not by itself establish — reduced per-cell checkpoint engagement, because a bulk measurement cannot separate lower T-cell/APC abundance from lower per-cell TIM-3. Bulk TIM-3 down-regulation is not unprecedented in sepsis: lower TIM-3 mRNA in peripheral blood mononuclear cells has been reported in severe sepsis relative to sepsis [16], and the same primary direction was reported in a human severe-sepsis PBMC cohort by Yang et al. [38]. The present result is therefore a cohort-specific net-expression observation, not a refutation of the TIM-3-up exhaustion literature [16]. HAVCR2/TIM-3, a checkpoint expressed on both antigen-presenting cells and T cells, was also down-regulated in Mars1 (Δ=−0.35, adj.P=2.8×10⁻¹³). Because this is a bulk-blood measurement, the direction cannot distinguish reduced APC/monocyte abundance from lower per-cell expression, nor can it adjudicate between an APC-abundance signal and the T-cell-intrinsic exhaustion implied by PDCD1 up-regulation; single-cell or flow-cytometric resolution is required before attributing the signal to either mechanism. The Mars1 program also carried a candidate, incompletely supported T-cell-exhaustion signal: only PDCD1 was significantly up-regulated (Δ=+0.16, adj.P=3.0×10⁻¹⁰), whereas LAG3 was directionally but not significantly up (adj.P=0.55). This up-regulation is consistent with, but does not by itself establish, T-cell exhaustion in Mars1 and was not part of the original Mars1 definition of Scicluna et al. [5]; it is reported here as a hypothesis requiring single-cell confirmation. Because these are bulk whole-blood measurements, every direction reported here is subject to the same limitation: a shift in the proportions of monocytes, lymphocytes and granulocytes, or the appearance of immature myeloid and erythroid precursors, will move all transcripts from one compartment coherently and cannot be separated from per-cell regulation; we therefore do not read any individual gene — including HAVCR2/TIM-3 and including the five hubs — as evidence of reduced per-cell expression, and the monocyte HLA-DR literature, which is protein-level and flow-cytometric, remains the independent corroboration for the monocytic arm. In the endotype-only sensitivity contrast (Mars1 vs Mars2/3/4; Supplementary Table S01b), the myeloid/monocytic component is unaffected (CD14 Δ = −0.77, FCGR3A −0.56, CD74 −0.49, HLA-DRB1 −0.59, HAVCR2 −0.39; all retain |Δ| ≥ 0.3 and FDR &lt; 0.05), whereas the T-cell component attenuates by 60–100% (e.g. IL7R −0.60 → −0.20, CD3D −0.44 → −0.15, GZMK −0.31 → −0.07; CTLA4 and CD8B change sign) and a further three genes, including the hub HLA-DQA1 (−0.53 → −0.24), fall below the |logFC| ≥ 0.3 threshold. The endotype-specific immunosuppression described here is therefore myeloid-dominated; T-cell-marker changes in the primary contrast are confounded by sepsis-versus-control status and are not presented as part of the endotype program. PDCD1 up-regulation is strengthened in the endotype-only contrast (Δ = +0.21).</w:t>
+        <w:t xml:space="preserve"> HAVCR2/TIM-3 expression, which is compatible with — but does not by itself establish — reduced per-cell checkpoint engagement, because a bulk measurement cannot separate lower T-cell/APC abundance from lower per-cell TIM-3. Bulk TIM-3 down-regulation is not unprecedented in sepsis: lower TIM-3 mRNA in peripheral blood mononuclear cells has been reported in severe sepsis relative to sepsis [16], and the same primary direction was reported in a human severe-sepsis PBMC cohort by Yang et al. [17]. The present result is therefore a cohort-specific net-expression observation, not a refutation of the TIM-3-up exhaustion literature [16]. HAVCR2/TIM-3, a checkpoint expressed on both antigen-presenting cells and T cells, was also down-regulated in Mars1 (Δ=−0.35, adj.P=2.8×10⁻¹³). Because this is a bulk-blood measurement, the direction cannot distinguish reduced APC/monocyte abundance from lower per-cell expression, nor can it adjudicate between an APC-abundance signal and the T-cell-intrinsic exhaustion implied by PDCD1 up-regulation; single-cell or flow-cytometric resolution is required before attributing the signal to either mechanism. The Mars1 program also carried a candidate, incompletely supported T-cell-exhaustion signal: only PDCD1 was significantly up-regulated (Δ=+0.16, adj.P=3.0×10⁻¹⁰), whereas LAG3 was directionally but not significantly up (adj.P=0.55). This up-regulation is consistent with, but does not by itself establish, T-cell exhaustion in Mars1 and was not part of the original Mars1 definition of Scicluna et al. [5]; it is reported here as a hypothesis requiring single-cell confirmation. Because these are bulk whole-blood measurements, every direction reported here is subject to the same limitation: a shift in the proportions of monocytes, lymphocytes and granulocytes, or the appearance of immature myeloid and erythroid precursors, will move all transcripts from one compartment coherently and cannot be separated from per-cell regulation; we therefore do not read any individual gene — including HAVCR2/TIM-3 and including the five hubs — as evidence of reduced per-cell expression, and the monocyte HLA-DR literature, which is protein-level and flow-cytometric, remains the independent corroboration for the monocytic arm. In the endotype-only sensitivity contrast (Mars1 vs Mars2/3/4; Supplementary Table S01b), the myeloid/monocytic component is unaffected (CD14 Δ = −0.77, FCGR3A −0.56, CD74 −0.49, HLA-DRB1 −0.59, HAVCR2 −0.39; all retain |Δ| ≥ 0.3 and FDR &lt; 0.05), whereas the T-cell component attenuates by 60–100% (e.g. IL7R −0.60 → −0.20, CD3D −0.44 → −0.15, GZMK −0.31 → −0.07; CTLA4 and CD8B change sign) and a further three genes, including the hub HLA-DQA1 (−0.53 → −0.24), fall below the |logFC| ≥ 0.3 threshold. The endotype-specific immunosuppression described here is therefore myeloid-dominated; T-cell-marker changes in the primary contrast are confounded by sepsis-versus-control status and are not presented as part of the endotype program. PDCD1 up-regulation is strengthened in the endotype-only contrast (Δ = +0.21).</w:t>
       </w:r>
     </w:p>
     <w:p>
@@ -2136,7 +2136,7 @@
           <w:b w:val="0"/>
           <w:i w:val="0"/>
         </w:rPr>
-        <w:t xml:space="preserve"> down-regulation reported here is a transcript-level immunoparalysis proxy and should not be equated with monocyte membrane mHLA-DR, the validated bedside immunoparalysis biomarker (Monneret et al. [27]; Venet &amp; Monneret [29]) — the two are complementary, not interchangeable; the score is nonetheless used prognostically across the whole cohort, not only within Mars1, and its association with 28-day death is reported separately in §3.4. Mars1 also classified 28-day death at AUC 0.578 (binary indicator; the continuous signature in §3.4 is stronger) [</w:t>
+        <w:t xml:space="preserve"> down-regulation reported here is a transcript-level immunoparalysis proxy and should not be equated with monocyte membrane mHLA-DR, the validated bedside immunoparalysis biomarker (Monneret et al. [18]; Venet &amp; Monneret [19]) — the two are complementary, not interchangeable; the score is nonetheless used prognostically across the whole cohort, not only within Mars1, and its association with 28-day death is reported separately in §3.4. Mars1 also classified 28-day death at AUC 0.578 (binary indicator; the continuous signature in §3.4 is stronger) [</w:t>
       </w:r>
       <w:r>
         <w:rPr>
@@ -2691,7 +2691,7 @@
           <w:b w:val="0"/>
           <w:i w:val="0"/>
         </w:rPr>
-        <w:t>The tri-method ML consensus identified five immune hub genes anchored in the antigen-presentation/monocytic program (CD74, HLA-DQA1, CD14, FCGR3A) plus the co-inhibitory checkpoint HAVCR2/TIM-3 (expressed on T cells and antigen-presenting cells), and one non-immune, erythroid/heme-module gene, FIS1 — a mitochondrial-fission protein (Yoon et al. [37]) — (which entered the candidate pool through the top-20 degree-centrality branch of §2.5, where it ranked 12th, rather than through the immune-annotated branch). Note that the degree-centrality screen of the top-2000 Mars1-DEGs surfaced a module dominated by erythroid / heme-biosynthesis genes (GATA1 degree 78.4, CGB 76.1, EPB49 72.5; FIS1 ranked 12th), consistent with the up-regulated heme program previously reported in Mars1; the five immune hubs plus the FIS1 co-expression passenger were therefore carried by the tri-method ML consensus (which selects on 28-day-survival-associated, immune-annotated genes) rather than by the co-expression network alone [</w:t>
+        <w:t>The tri-method ML consensus identified five immune hub genes anchored in the antigen-presentation/monocytic program (CD74, HLA-DQA1, CD14, FCGR3A) plus the co-inhibitory checkpoint HAVCR2/TIM-3 (expressed on T cells and antigen-presenting cells), and one non-immune, erythroid/heme-module gene, FIS1 — a mitochondrial-fission protein (Yoon et al. [20]) — (which entered the candidate pool through the top-20 degree-centrality branch of §2.5, where it ranked 12th, rather than through the immune-annotated branch). Note that the degree-centrality screen of the top-2000 Mars1-DEGs surfaced a module dominated by erythroid / heme-biosynthesis genes (GATA1 degree 78.4, CGB 76.1, EPB49 72.5; FIS1 ranked 12th), consistent with the up-regulated heme program previously reported in Mars1; the five immune hubs plus the FIS1 co-expression passenger were therefore carried by the tri-method ML consensus (which selects on 28-day-survival-associated, immune-annotated genes) rather than by the co-expression network alone [</w:t>
       </w:r>
       <w:r>
         <w:rPr>
@@ -2766,7 +2766,7 @@
           <w:b w:val="0"/>
           <w:i w:val="0"/>
         </w:rPr>
-        <w:t xml:space="preserve"> — an inner-loop estimate after fixed feature selection on the same 28-day labels (events-per-variable = 114/30 ≈ 3.8, well below the conventional ≥10 rule), and therefore optimistic. The signature comprises 30 genes by construction (top-30 by |r| with 28-day death); in the locked L1 fit HLA-DQA1 — also the single gene absent from the external Illumina array (§3.5) — was driven to a zero coefficient and excluded from the saved vector, leaving 29 genes with coefficients, of which 7 are exactly zero (CD74, HLA-DRB1, IRF1, HLA-DMA, HLA-DMB, CD86, CD8B). The external AUC 0.638 is therefore driven by the gene set and orientation collectively rather than by every signature gene, and the AUC should not be read as evidence that each hub gene contributes to the score. Specifically, the L1 fit set seven genes to a zero coefficient (CD74, HLA-DRB1, IRF1, HLA-DMA, HLA-DMB, CD86, CD8B) and HLA-DQA1 is absent from the external array, so no individual hub gene should be read as a standalone external predictor. Cross-validated and training ROC: [ , ]. Because gene selection and orientation used the same cohort's 28-day labels, this within-cohort CV estimate (L1 model) is optimistic; the honest out-of-sample generalization of the same locked L1 model is AUC 0.585 (95% CI 0.469–0.696), whose interval includes 0.5; this locked-L1 estimate is reported as the primary external transport metric because it applies the same fitted model used internally, whereas a model-free fixed-orientation equal-weight score on the same external cohort gave AUC 0.638 (95% CI 0.532–0.748) and is reported as a pre-specified sensitivity analysis (it carries no cohort-specific weights but also no cohort-specific learning); the two external metrics differ by 0.053 and the like-for-like transport loss for the L1 model is 0.074 AUC units. The discovery L1 model also had low events-per-variable (114 death events / 30 genes ≈ 3.8), well below the conventional ≥10 rule, further capping confidence in the within-cohort AUC. Relative to the IRG benchmark reported by Peng et al. [8] (0.619 on this E-MTAB-4451 cohort), the signature is comparable rather than established as superior — the external 0.638 falls within sampling noise of 0.619 (DeLong P ≈ 0.56, not significant) and within the signature's own 95% CI. A 3-gene IRG proxy recomputed here was 0.529 (a weak reference only — its CI overlaps the other benchmarks — because it lacks the full IRG gene set) and is reported only as a weak lower-bound reference, not as a competing benchmark; the published IRG benchmark was reported as a single point estimate without a confidence interval, so a formal difference test against it was not performed and the difference is not established as statistically meaningful. Calibration and decision-curve analytics [17] for the external equal-weight score are in Fig. S6 ( ): a logistic recalibration on the 106-patient external cohort (52 deaths) gave a calibration slope of 0.50 with intercept −0.04 (calibration-in-the-large adequate), meaning the score </w:t>
+        <w:t xml:space="preserve"> — an inner-loop estimate after fixed feature selection on the same 28-day labels (events-per-variable = 114/30 ≈ 3.8, well below the conventional ≥10 rule), and therefore optimistic. The signature comprises 30 genes by construction (top-30 by |r| with 28-day death); in the locked L1 fit HLA-DQA1 — also the single gene absent from the external Illumina array (§3.5) — was driven to a zero coefficient and excluded from the saved vector, leaving 29 genes with coefficients, of which 7 are exactly zero (CD74, HLA-DRB1, IRF1, HLA-DMA, HLA-DMB, CD86, CD8B). The external AUC 0.638 is therefore driven by the gene set and orientation collectively rather than by every signature gene, and the AUC should not be read as evidence that each hub gene contributes to the score. Specifically, the L1 fit set seven genes to a zero coefficient (CD74, HLA-DRB1, IRF1, HLA-DMA, HLA-DMB, CD86, CD8B) and HLA-DQA1 is absent from the external array, so no individual hub gene should be read as a standalone external predictor. Cross-validated and training ROC: [ , ]. Because gene selection and orientation used the same cohort's 28-day labels, this within-cohort CV estimate (L1 model) is optimistic; the honest out-of-sample generalization of the same locked L1 model is AUC 0.585 (95% CI 0.469–0.696), whose interval includes 0.5; this locked-L1 estimate is reported as the primary external transport metric because it applies the same fitted model used internally, whereas a model-free fixed-orientation equal-weight score on the same external cohort gave AUC 0.638 (95% CI 0.532–0.748) and is reported as a pre-specified sensitivity analysis (it carries no cohort-specific weights but also no cohort-specific learning); the two external metrics differ by 0.053 and the like-for-like transport loss for the L1 model is 0.074 AUC units. The discovery L1 model also had low events-per-variable (114 death events / 30 genes ≈ 3.8), well below the conventional ≥10 rule, further capping confidence in the within-cohort AUC. Relative to the IRG benchmark reported by Peng et al. [8] (0.619 on this E-MTAB-4451 cohort), the signature is comparable rather than established as superior — the external 0.638 falls within sampling noise of 0.619 (DeLong P ≈ 0.56, not significant) and within the signature's own 95% CI. A 3-gene IRG proxy recomputed here was 0.529 (a weak reference only — its CI overlaps the other benchmarks — because it lacks the full IRG gene set) and is reported only as a weak lower-bound reference, not as a competing benchmark; the published IRG benchmark was reported as a single point estimate without a confidence interval, so a formal difference test against it was not performed and the difference is not established as statistically meaningful. Calibration and decision-curve analytics [21] for the external equal-weight score are in Fig. S6 ( ): a logistic recalibration on the 106-patient external cohort (52 deaths) gave a calibration slope of 0.50 with intercept −0.04 (calibration-in-the-large adequate), meaning the score </w:t>
       </w:r>
       <w:r>
         <w:rPr>
@@ -3020,7 +3020,7 @@
           <w:b/>
           <w:i w:val="0"/>
         </w:rPr>
-        <w:t>IFN-γ [18] rescued 4/5 antigen-presentation genes in its curated set</w:t>
+        <w:t>IFN-γ [22] rescued 4/5 antigen-presentation genes in its curated set</w:t>
       </w:r>
       <w:r>
         <w:rPr>
@@ -3787,7 +3787,7 @@
           <w:b w:val="0"/>
           <w:i w:val="0"/>
         </w:rPr>
-        <w:t xml:space="preserve">). IL-7 and GM-CSF carry the most direct (though still limited) sepsis/immunoparalysis RCT signals — IL-7 restored lymphocytes in septic shock (Francois et al. [19]), GM-CSF restored monocyte HLA-DR (Meisel et al. [20]) — whereas IFN-γ is approved for chronic granulomatous disease and is a canonical MHC-II inducer with limited sepsis-specific signals (Döcke et al. [21]); azithromycin [22], lenalidomide [23] and thymosin α1 [24] are mechanistically plausible or regionally used with weaker dedicated sepsis trials. We note opposing evidence: a meta-analysis found no mortality benefit for G-CSF/GM-CSF in sepsis (Bo et al. [25]), tempering the mechanistic enthusiasm. A randomised trial in precisely this mHLA-DR-low immunoparalysed population is directly relevant and serves as a </w:t>
+        <w:t xml:space="preserve">). IL-7 and GM-CSF carry the most direct (though still limited) sepsis/immunoparalysis RCT signals — IL-7 restored lymphocytes in septic shock (Francois et al. [23]), GM-CSF restored monocyte HLA-DR (Meisel et al. [24]) — whereas IFN-γ is approved for chronic granulomatous disease and is a canonical MHC-II inducer with limited sepsis-specific signals (Döcke et al. [25]); azithromycin [26], lenalidomide [27] and thymosin α1 [28] are mechanistically plausible or regionally used with weaker dedicated sepsis trials. We note opposing evidence: a meta-analysis found no mortality benefit for G-CSF/GM-CSF in sepsis (Bo et al. [29]), tempering the mechanistic enthusiasm. A randomised trial in precisely this mHLA-DR-low immunoparalysed population is directly relevant and serves as a </w:t>
       </w:r>
       <w:r>
         <w:rPr>
@@ -3803,7 +3803,7 @@
           <w:b w:val="0"/>
           <w:i w:val="0"/>
         </w:rPr>
-        <w:t xml:space="preserve"> for the repositioning axis: Giamarellos-Bourboulis et al. [26] randomised a precision-immunotherapy strategy (recombinant IFN-γ for the immunoparalysed arm, anakinra for the macrophage activation-like syndrome (MALS) arm) in septic patients and reported SOFA improvement in the IFN-γ/immunoparalysis arm but </w:t>
+        <w:t xml:space="preserve"> for the repositioning axis: Giamarellos-Bourboulis et al. [30] randomised a precision-immunotherapy strategy (recombinant IFN-γ for the immunoparalysed arm, anakinra for the macrophage activation-like syndrome (MALS) arm) in septic patients and reported SOFA improvement in the IFN-γ/immunoparalysis arm but </w:t>
       </w:r>
       <w:r>
         <w:rPr>
@@ -3819,7 +3819,7 @@
           <w:b w:val="0"/>
           <w:i w:val="0"/>
         </w:rPr>
-        <w:t xml:space="preserve"> — so axis reversal by IFN-γ does not equal clinical benefit — and, critically for the present endotyping argument, 53% of screened patients were unclassifiable by a dual ferritin-and-mHLA-DR algorithm (mHLA-DR cutoff &lt;5,000 receptors/cell on CD45/CD14 monocytes; "unclassifiable" = normal ferritin AND normal HLA-DR); mHLA-DR remains the most validated single clinical anchor for sepsis immunoparalysis (Monneret et al. [27]; Joshi et al. [28]; Venet &amp; Monneret [29]). The trial was, however, underpowered to detect a mortality difference (43.5% vs 49.7% 28-day mortality; P = .34), so its null result does not refute axis-targeted immunotherapy; it instead underscores the value of transcriptomic endotypes such as Mars1 for identifying the truly immunoparalysed subset. Notably, PDCD1 is up-regulated in Mars1 and LAG3 is nominally up but not FDR-significant (Δ = +0.04, adj.P = 0.55), whereas HAVCR2/TIM-3 is significantly down-regulated (§3.1). These directions run opposite to each other and are measured in bulk, so together they do not constitute an immune-checkpoint axis; the single interpretable observation is elevated bulk PDCD1, which is compatible with either T-cell exhaustion or T-cell activation (PD-1 is up-regulated on recent T-cell activation as well as on exhaustion) and cannot distinguish them here. Checkpoint-blocking agents (anti–PD-1/PD-L1, anti–CTLA-4) were therefore not prioritised, but we do not regard them as mechanistically contraindicated: a randomised, placebo-controlled dose-escalation study of the anti–PD-L1 antibody BMS-936559 in participants with sepsis-associated immunosuppression (absolute lymphocyte count ≤ 1,100/µL; n = 20 treated) reported full receptor occupancy, no drug-related cytokine release, and — at the two highest doses — an apparent sustained increase in monocyte HLA-DR above 5,000 antibodies/cell persisting beyond 28 days [30]; the Phase 1b nivolumab study was a safety, tolerability, pharmacokinetic and pharmacodynamic study without an efficacy signal [31]. Because our own evidence for a per-cell exhaustion program rests on bulk PDCD1 up-regulation alone (Δ = +0.16, §3.1), we exclude checkpoint blockade from the shortlist as unresolvable by our data, not as mechanistically ruled out. This reasoned scope decision is recorded rather than an oversight. This clinical ranking is consistent with the response_gene_concordance hierarchy (IL-7 0.80 &gt; GM-CSF 0.67 &gt; IFN-γ 0.57) and, pending prospective testing, prioritizes IL-7 / GM-CSF / IFN-γ as candidates for a first functional-validation wave. The clinical-translation table (08b) reports a </w:t>
+        <w:t xml:space="preserve"> — so axis reversal by IFN-γ does not equal clinical benefit — and, critically for the present endotyping argument, 53% of screened patients were unclassifiable by a dual ferritin-and-mHLA-DR algorithm (mHLA-DR cutoff &lt;5,000 receptors/cell on CD45/CD14 monocytes; "unclassifiable" = normal ferritin AND normal HLA-DR); mHLA-DR remains the most validated single clinical anchor for sepsis immunoparalysis (Monneret et al. [18]; Joshi et al. [31]; Venet &amp; Monneret [19]). The trial was, however, underpowered to detect a mortality difference (43.5% vs 49.7% 28-day mortality; P = .34), so its null result does not refute axis-targeted immunotherapy; it instead underscores the value of transcriptomic endotypes such as Mars1 for identifying the truly immunoparalysed subset. Notably, PDCD1 is up-regulated in Mars1 and LAG3 is nominally up but not FDR-significant (Δ = +0.04, adj.P = 0.55), whereas HAVCR2/TIM-3 is significantly down-regulated (§3.1). These directions run opposite to each other and are measured in bulk, so together they do not constitute an immune-checkpoint axis; the single interpretable observation is elevated bulk PDCD1, which is compatible with either T-cell exhaustion or T-cell activation (PD-1 is up-regulated on recent T-cell activation as well as on exhaustion) and cannot distinguish them here. Checkpoint-blocking agents (anti–PD-1/PD-L1, anti–CTLA-4) were therefore not prioritised, but we do not regard them as mechanistically contraindicated: a randomised, placebo-controlled dose-escalation study of the anti–PD-L1 antibody BMS-936559 in participants with sepsis-associated immunosuppression (absolute lymphocyte count ≤ 1,100/µL; n = 20 treated) reported full receptor occupancy, no drug-related cytokine release, and — at the two highest doses — an apparent sustained increase in monocyte HLA-DR above 5,000 antibodies/cell persisting beyond 28 days [32]; the Phase 1b nivolumab study was a safety, tolerability, pharmacokinetic and pharmacodynamic study without an efficacy signal [33]. Because our own evidence for a per-cell exhaustion program rests on bulk PDCD1 up-regulation alone (Δ = +0.16, §3.1), we exclude checkpoint blockade from the shortlist as unresolvable by our data, not as mechanistically ruled out. This reasoned scope decision is recorded rather than an oversight. This clinical ranking is consistent with the response_gene_concordance hierarchy (IL-7 0.80 &gt; GM-CSF 0.67 &gt; IFN-γ 0.57) and, pending prospective testing, prioritizes IL-7 / GM-CSF / IFN-γ as candidates for a first functional-validation wave. The clinical-translation table (08b) reports a </w:t>
       </w:r>
       <w:r>
         <w:rPr>
@@ -3851,7 +3851,7 @@
           <w:b w:val="0"/>
           <w:i w:val="0"/>
         </w:rPr>
-        <w:t xml:space="preserve"> used in Table 3; both are descriptive and need not coincide. BCG is not carried as an acute rescue candidate. Its clinical signal comes from prevention trials in non-septic populations — a randomised trial in the elderly reported fewer respiratory infections with BCG versus placebo [32], whereas a randomised trial in ~2,000 elderly participants found no reduction in clinically relevant respiratory infection (subdistribution HR 1.26, 98.2% CI 0.65–2.44) [33] — its heterologous effects require months to emerge [34],[35], and it is a live attenuated vaccine with recognised risk of dissemination in immunocompromised hosts. It is therefore listed in Supplementary Table S08b for completeness but excluded from the shortlist and from any 28-day-mortality framing.</w:t>
+        <w:t xml:space="preserve"> used in Table 3; both are descriptive and need not coincide. BCG is not carried as an acute rescue candidate. Its clinical signal comes from prevention trials in non-septic populations — a randomised trial in the elderly reported fewer respiratory infections with BCG versus placebo [34], whereas a randomised trial in ~2,000 elderly participants found no reduction in clinically relevant respiratory infection (subdistribution HR 1.26, 98.2% CI 0.65–2.44) [35] — its heterologous effects require months to emerge [36],[37], and it is a live attenuated vaccine with recognised risk of dissemination in immunocompromised hosts. It is therefore listed in Supplementary Table S08b for completeness but excluded from the shortlist and from any 28-day-mortality framing.</w:t>
       </w:r>
     </w:p>
     <w:p>
@@ -3878,7 +3878,7 @@
           <w:b w:val="0"/>
           <w:i w:val="0"/>
         </w:rPr>
-        <w:t xml:space="preserve">To move the shortlist from mechanism-anchored to connectivity-scored, we computed a single-set reverse-connectivity (rescue) score for every small-molecule perturbagen in the LINCS L1000 Phase-II library (GSE92742 Level 5 [36], MODZ consensus; 20,413 </w:t>
+        <w:t xml:space="preserve">To move the shortlist from mechanism-anchored to connectivity-scored, we computed a single-set reverse-connectivity (rescue) score for every small-molecule perturbagen in the LINCS L1000 Phase-II library (GSE92742 Level 5 [38], MODZ consensus; 20,413 </w:t>
       </w:r>
       <w:r>
         <w:rPr>
@@ -4199,7 +4199,7 @@
           <w:b w:val="0"/>
           <w:i w:val="0"/>
         </w:rPr>
-        <w:t xml:space="preserve">The repositioning shortlist encompasses mechanistically distinct immune-restorative strategies: IFN-γ / GM-CSF rebuild antigen presentation and myeloid function; IL-7 counters T-cell exhaustion; BCG draws on trained immunity [34], [35]. Checkpoint-blockade is not straightforward in sepsis immunosuppression — the anti–PD-1 antibody nivolumab was tested only in a Phase 1b safety/pharmacokinetic study that was not powered to show efficacy [31] — so the present analysis deliberately avoids checkpoint inhibitors pending efficacy data. These are not novel sepsis drugs per se, but our analysis maps </w:t>
+        <w:t xml:space="preserve">The repositioning shortlist encompasses mechanistically distinct immune-restorative strategies: IFN-γ / GM-CSF rebuild antigen presentation and myeloid function; IL-7 counters T-cell exhaustion; BCG draws on trained immunity [36], [37]. Checkpoint-blockade is not straightforward in sepsis immunosuppression — the anti–PD-1 antibody nivolumab was tested only in a Phase 1b safety/pharmacokinetic study that was not powered to show efficacy [33] — so the present analysis deliberately avoids checkpoint inhibitors pending efficacy data. These are not novel sepsis drugs per se, but our analysis maps </w:t>
       </w:r>
       <w:r>
         <w:rPr>
@@ -6404,7 +6404,7 @@
           <w:b w:val="0"/>
           <w:i w:val="0"/>
         </w:rPr>
-        <w:t>17. Schuemie, M. J., Ryan, P. B., DuMouchel, W., Suchard, M. A., Madigan, D. Interpreting observational studies: why empirical calibration is needed to correct p-values. Stat. Med. 2013;33:209–218. doi:10.1002/sim.5925.</w:t>
+        <w:t>17. Yang, X. et al. T cell Ig mucin-3 promotes homeostasis of sepsis by negatively regulating the TLR response. J. Immunol. 2013;190:2068–2079. doi:10.4049/jimmunol.1202661.</w:t>
       </w:r>
     </w:p>
     <w:p>
@@ -6417,7 +6417,7 @@
           <w:b w:val="0"/>
           <w:i w:val="0"/>
         </w:rPr>
-        <w:t>18. Basham, T. Y., Merigan, T. C. Recombinant interferon-gamma increases HLA-DR synthesis and expression. J. Immunol. 1983;130:1492–1494. doi:10.4049/jimmunol.130.4.1492.</w:t>
+        <w:t>18. Monneret, G., Venet, F., Pachot, A., Lepape, A. Monitoring immune dysfunctions in the septic patient: a new skin for the old ceremony. Mol. Med. 2008;14:64–78. doi:10.2119/2007-00102.Monneret.</w:t>
       </w:r>
     </w:p>
     <w:p>
@@ -6430,7 +6430,7 @@
           <w:b w:val="0"/>
           <w:i w:val="0"/>
         </w:rPr>
-        <w:t>19. François, B. et al. Interleukin-7 restores lymphocytes in septic shock: the IRIS-7 randomized clinical trial. JCI Insight. 2018;3:e98960. doi:10.1172/jci.insight.98960.</w:t>
+        <w:t>19. Venet, F., Monneret, G. Advances in the understanding and treatment of sepsis-induced immunosuppression. Nat. Rev. Nephrol. 2018;14:121–137. doi:10.1038/nrneph.2017.165.</w:t>
       </w:r>
     </w:p>
     <w:p>
@@ -6443,7 +6443,7 @@
           <w:b w:val="0"/>
           <w:i w:val="0"/>
         </w:rPr>
-        <w:t>20. Meisel, C. et al. Granulocyte–macrophage colony-stimulating factor to reverse sepsis-associated immunosuppression: a double-blind, randomized, placebo-controlled multicenter trial. Am. J. Respir. Crit. Care Med. 2009;180:640–648. doi:10.1164/rccm.200903-0363OC.</w:t>
+        <w:t>20. Yoon, Y. et al. The mitochondrial protein hFis1 regulates mitochondrial fission in mammalian cells through an interaction with the dynamin-like protein DLP1. Mol. Cell. Biol. 2003;23:5409–5420. doi:10.1128/MCB.23.15.5409-5420.2003.</w:t>
       </w:r>
     </w:p>
     <w:p>
@@ -6456,7 +6456,7 @@
           <w:b w:val="0"/>
           <w:i w:val="0"/>
         </w:rPr>
-        <w:t>21. Döcke, W. et al. Monocyte deactivation in septic patients: restoration by IFN-γ treatment. Nat. Med. 1997;3:678–681. doi:10.1038/nm0697-678.</w:t>
+        <w:t>21. Schuemie, M. J., Ryan, P. B., DuMouchel, W., Suchard, M. A., Madigan, D. Interpreting observational studies: why empirical calibration is needed to correct p-values. Stat. Med. 2013;33:209–218. doi:10.1002/sim.5925.</w:t>
       </w:r>
     </w:p>
     <w:p>
@@ -6469,7 +6469,7 @@
           <w:b w:val="0"/>
           <w:i w:val="0"/>
         </w:rPr>
-        <w:t>22. Parnham, M. J. et al. Azithromycin: mechanisms of action and their relevance for clinical applications. Pharmacol. Ther. 2014;143:225–245. doi:10.1016/j.pharmthera.2014.03.003.</w:t>
+        <w:t>22. Basham, T. Y., Merigan, T. C. Recombinant interferon-gamma increases HLA-DR synthesis and expression. J. Immunol. 1983;130:1492–1494. doi:10.4049/jimmunol.130.4.1492.</w:t>
       </w:r>
     </w:p>
     <w:p>
@@ -6482,7 +6482,7 @@
           <w:b w:val="0"/>
           <w:i w:val="0"/>
         </w:rPr>
-        <w:t>23. McDaniel, J. M. et al. Reversal of T-cell tolerance in myelodysplastic syndrome through lenalidomide immune modulation. Leukemia. 2011;26:1425–1429. doi:10.1038/leu.2011.359.</w:t>
+        <w:t>23. François, B. et al. Interleukin-7 restores lymphocytes in septic shock: the IRIS-7 randomized clinical trial. JCI Insight. 2018;3:e98960. doi:10.1172/jci.insight.98960.</w:t>
       </w:r>
     </w:p>
     <w:p>
@@ -6495,7 +6495,7 @@
           <w:b w:val="0"/>
           <w:i w:val="0"/>
         </w:rPr>
-        <w:t>24. Li, C., Bo, L., Liu, Q., Jin, F. Thymosin alpha1 based immunomodulatory therapy for sepsis: a systematic review and meta-analysis. Int. J. Infect. Dis. 2015;33:90–96. doi:10.1016/j.ijid.2014.12.032.</w:t>
+        <w:t>24. Meisel, C. et al. Granulocyte–macrophage colony-stimulating factor to reverse sepsis-associated immunosuppression: a double-blind, randomized, placebo-controlled multicenter trial. Am. J. Respir. Crit. Care Med. 2009;180:640–648. doi:10.1164/rccm.200903-0363OC.</w:t>
       </w:r>
     </w:p>
     <w:p>
@@ -6508,7 +6508,7 @@
           <w:b w:val="0"/>
           <w:i w:val="0"/>
         </w:rPr>
-        <w:t>25. Bo, L., Wang, F., Zhu, J., Li, J., Deng, X. Granulocyte-colony stimulating factor (G-CSF) and granulocyte-macrophage colony stimulating factor (GM-CSF) for sepsis: a meta-analysis. Crit. Care. 2011;15:R58. doi:10.1186/cc10031.</w:t>
+        <w:t>25. Döcke, W. et al. Monocyte deactivation in septic patients: restoration by IFN-γ treatment. Nat. Med. 1997;3:678–681. doi:10.1038/nm0697-678.</w:t>
       </w:r>
     </w:p>
     <w:p>
@@ -6521,7 +6521,7 @@
           <w:b w:val="0"/>
           <w:i w:val="0"/>
         </w:rPr>
-        <w:t>26. Giamarellos-Bourboulis, E. J. et al. Precision immunotherapy to improve sepsis outcomes: the ImmunoSep randomized clinical trial. JAMA. 2025;335:775–786. doi:10.1001/jama.2025.24175.</w:t>
+        <w:t>26. Parnham, M. J. et al. Azithromycin: mechanisms of action and their relevance for clinical applications. Pharmacol. Ther. 2014;143:225–245. doi:10.1016/j.pharmthera.2014.03.003.</w:t>
       </w:r>
     </w:p>
     <w:p>
@@ -6534,7 +6534,7 @@
           <w:b w:val="0"/>
           <w:i w:val="0"/>
         </w:rPr>
-        <w:t>27. Monneret, G., Venet, F., Pachot, A., Lepape, A. Monitoring immune dysfunctions in the septic patient: a new skin for the old ceremony. Mol. Med. 2008;14:64–78. doi:10.2119/2007-00102.Monneret.</w:t>
+        <w:t>27. McDaniel, J. M. et al. Reversal of T-cell tolerance in myelodysplastic syndrome through lenalidomide immune modulation. Leukemia. 2011;26:1425–1429. doi:10.1038/leu.2011.359.</w:t>
       </w:r>
     </w:p>
     <w:p>
@@ -6547,7 +6547,7 @@
           <w:b w:val="0"/>
           <w:i w:val="0"/>
         </w:rPr>
-        <w:t>28. Joshi, I., Carney, W. P., Rock, E. P. Utility of monocyte HLA-DR and rationale for therapeutic GM-CSF in sepsis immunoparalysis. Front. Immunol. 2023;14:1130214. doi:10.3389/fimmu.2023.1130214.</w:t>
+        <w:t>28. Li, C., Bo, L., Liu, Q., Jin, F. Thymosin alpha1 based immunomodulatory therapy for sepsis: a systematic review and meta-analysis. Int. J. Infect. Dis. 2015;33:90–96. doi:10.1016/j.ijid.2014.12.032.</w:t>
       </w:r>
     </w:p>
     <w:p>
@@ -6560,7 +6560,7 @@
           <w:b w:val="0"/>
           <w:i w:val="0"/>
         </w:rPr>
-        <w:t>29. Venet, F., Monneret, G. Advances in the understanding and treatment of sepsis-induced immunosuppression. Nat. Rev. Nephrol. 2018;14:121–137. doi:10.1038/nrneph.2017.165.</w:t>
+        <w:t>29. Bo, L., Wang, F., Zhu, J., Li, J., Deng, X. Granulocyte-colony stimulating factor (G-CSF) and granulocyte-macrophage colony stimulating factor (GM-CSF) for sepsis: a meta-analysis. Crit. Care. 2011;15:R58. doi:10.1186/cc10031.</w:t>
       </w:r>
     </w:p>
     <w:p>
@@ -6573,7 +6573,7 @@
           <w:b w:val="0"/>
           <w:i w:val="0"/>
         </w:rPr>
-        <w:t>30. Hotchkiss, R. S. et al. Immune checkpoint inhibition in sepsis: a Phase 1b randomized, placebo-controlled, single ascending dose study of anti-programmed cell death-ligand 1 antibody (BMS-936559). Crit. Care Med. 2019;47:632–642. doi:10.1097/CCM.0000000000003685.</w:t>
+        <w:t>30. Giamarellos-Bourboulis, E. J. et al. Precision immunotherapy to improve sepsis outcomes: the ImmunoSep randomized clinical trial. JAMA. 2025;335:775–786. doi:10.1001/jama.2025.24175.</w:t>
       </w:r>
     </w:p>
     <w:p>
@@ -6586,7 +6586,7 @@
           <w:b w:val="0"/>
           <w:i w:val="0"/>
         </w:rPr>
-        <w:t>31. Hotchkiss, R. S. et al. Immune checkpoint inhibition in sepsis: a Phase 1b randomized study to evaluate the safety, tolerability, pharmacokinetics, and pharmacodynamics of nivolumab. Intensive Care Med. 2019;45:1360–1371. doi:10.1007/s00134-019-05704-z.</w:t>
+        <w:t>31. Joshi, I., Carney, W. P., Rock, E. P. Utility of monocyte HLA-DR and rationale for therapeutic GM-CSF in sepsis immunoparalysis. Front. Immunol. 2023;14:1130214. doi:10.3389/fimmu.2023.1130214.</w:t>
       </w:r>
     </w:p>
     <w:p>
@@ -6599,7 +6599,7 @@
           <w:b w:val="0"/>
           <w:i w:val="0"/>
         </w:rPr>
-        <w:t>32. Giamarellos-Bourboulis, E. J. et al. Activate: randomized clinical trial of BCG vaccination against infection in the elderly. Cell. 2020;183:315–323. doi:10.1016/j.cell.2020.08.051.</w:t>
+        <w:t>32. Hotchkiss, R. S. et al. Immune checkpoint inhibition in sepsis: a Phase 1b randomized, placebo-controlled, single ascending dose study of anti-programmed cell death-ligand 1 antibody (BMS-936559). Crit. Care Med. 2019;47:632–642. doi:10.1097/CCM.0000000000003685.</w:t>
       </w:r>
     </w:p>
     <w:p>
@@ -6612,7 +6612,7 @@
           <w:b w:val="0"/>
           <w:i w:val="0"/>
         </w:rPr>
-        <w:t>33. Moorlag, S. J. C. F. M. et al. Efficacy of BCG vaccination against respiratory tract infections in older adults: a randomized controlled trial. J. Infect. Dis. 2022;226:129–138. doi:10.1093/infdis/jiac182.</w:t>
+        <w:t>33. Hotchkiss, R. S. et al. Immune checkpoint inhibition in sepsis: a Phase 1b randomized study to evaluate the safety, tolerability, pharmacokinetics, and pharmacodynamics of nivolumab. Intensive Care Med. 2019;45:1360–1371. doi:10.1007/s00134-019-05704-z.</w:t>
       </w:r>
     </w:p>
     <w:p>
@@ -6625,7 +6625,7 @@
           <w:b w:val="0"/>
           <w:i w:val="0"/>
         </w:rPr>
-        <w:t>34. Netea, M. G. et al. Trained immunity: a program of innate immune memory in health and disease. Science. 2016;352:aaf1098. doi:10.1126/science.aaf1098.</w:t>
+        <w:t>34. Giamarellos-Bourboulis, E. J. et al. Activate: randomized clinical trial of BCG vaccination against infection in the elderly. Cell. 2020;183:315–323. doi:10.1016/j.cell.2020.08.051.</w:t>
       </w:r>
     </w:p>
     <w:p>
@@ -6638,7 +6638,7 @@
           <w:b w:val="0"/>
           <w:i w:val="0"/>
         </w:rPr>
-        <w:t>35. Netea, M. G., Quintin, J., van der Meer, J. W. M. Trained immunity: a memory for innate host defense. Cell Host Microbe. 2011;9:355–361. doi:10.1016/j.chom.2011.04.006.</w:t>
+        <w:t>35. Moorlag, S. J. C. F. M. et al. Efficacy of BCG vaccination against respiratory tract infections in older adults: a randomized controlled trial. J. Infect. Dis. 2022;226:129–138. doi:10.1093/infdis/jiac182.</w:t>
       </w:r>
     </w:p>
     <w:p>
@@ -6651,7 +6651,7 @@
           <w:b w:val="0"/>
           <w:i w:val="0"/>
         </w:rPr>
-        <w:t>36. Subramanian, A. et al. A next generation connectivity map: L1000 platform and the first 1,000,000 profiles. Cell. 2017;171:1437–1452. doi:10.1016/j.cell.2017.10.049.</w:t>
+        <w:t>36. Netea, M. G. et al. Trained immunity: a program of innate immune memory in health and disease. Science. 2016;352:aaf1098. doi:10.1126/science.aaf1098.</w:t>
       </w:r>
     </w:p>
     <w:p>
@@ -6664,7 +6664,7 @@
           <w:b w:val="0"/>
           <w:i w:val="0"/>
         </w:rPr>
-        <w:t>37. Yoon, Y. et al. The mitochondrial protein hFis1 regulates mitochondrial fission in mammalian cells through an interaction with the dynamin-like protein DLP1. Mol. Cell. Biol. 2003;23:5409–5420. doi:10.1128/MCB.23.15.5409-5420.2003.</w:t>
+        <w:t>37. Netea, M. G., Quintin, J., van der Meer, J. W. M. Trained immunity: a memory for innate host defense. Cell Host Microbe. 2011;9:355–361. doi:10.1016/j.chom.2011.04.006.</w:t>
       </w:r>
     </w:p>
     <w:p>
@@ -6677,7 +6677,7 @@
           <w:b w:val="0"/>
           <w:i w:val="0"/>
         </w:rPr>
-        <w:t>38. Yang, X. et al. T cell Ig mucin-3 promotes homeostasis of sepsis by negatively regulating the TLR response. J. Immunol. 2013;190:2068–2079. doi:10.4049/jimmunol.1202661.</w:t>
+        <w:t>38. Subramanian, A. et al. A next generation connectivity map: L1000 platform and the first 1,000,000 profiles. Cell. 2017;171:1437–1452. doi:10.1016/j.cell.2017.10.049.</w:t>
       </w:r>
     </w:p>
     <w:p/>

</xml_diff>

<commit_message>
Revise to v1.23.0 (Round-21 graded revisions): remove misattributed DeLong P~0.56 (no per-sample IRG benchmark exists; actual DeLong vs 3-gene proxy P=0.156); soften pre-registered to pre-specified with CI-includes-0.5 caveat; reframe FIS1 death association as selection criterion restated (not independent confirmation); fix S05 traceability-table + S06 caption 'passenger' wording; correct manifest title word count (24) and Fig.S mapping (S1/S2/S3A-B/S6A-C/S7/S9/S10, no S4/S5/S8); bump CITATION.cff to v1.23.0; rebuild BMC docx; audit 31/32 green pending tag
</commit_message>
<xml_diff>
--- a/07_submission_bmc_v1.21.0/Manuscript.docx
+++ b/07_submission_bmc_v1.21.0/Manuscript.docx
@@ -887,7 +887,7 @@
           <w:b w:val="0"/>
           <w:i w:val="0"/>
         </w:rPr>
-        <w:t xml:space="preserve"> external transport metric, reported with a 95% CI from 2,000-sample bootstrap, because it provides the like-for-like out-of-sample comparison to the within-cohort cross-validated AUC (same fitted coefficients, no re-tuning). This primary designation was fixed before the external AUC was computed, so the primary claim is pre-registered rather than post-hoc. A fixed-orientation equal-weight score, carrying no cohort-specific weights and thus the portable component by construction, was added as a pre-specified </w:t>
+        <w:t xml:space="preserve"> external transport metric, reported with a 95% CI from 2,000-sample bootstrap, because it provides the like-for-like out-of-sample comparison to the within-cohort cross-validated AUC (same fitted coefficients, no re-tuning). This primary designation was fixed before the external AUC was computed, so the primary claim is pre-specified rather than post-hoc; as reported in §3.5, the primary locked-L1 estimate has a 95% CI that includes 0.5, so it is not significantly above chance. A fixed-orientation equal-weight score, carrying no cohort-specific weights and thus the portable component by construction, was added as a pre-specified </w:t>
       </w:r>
       <w:r>
         <w:rPr>
@@ -2535,7 +2535,7 @@
           <w:b w:val="0"/>
           <w:i w:val="0"/>
         </w:rPr>
-        <w:t xml:space="preserve"> ]. Armed with the module assignment, FIS1 belongs to module 2011, a 166-gene erythroid/heme module whose members include GATA1, KLF1, ALAS2, FECH, HBD, AHSP, SLC4A1, EPB49 and the reticulocyte mitophagy genes PINK1, BNIP3L and FUNDC2; none of the five immune hubs is a member of that module (the hubs fall in modules 2833 — the seven-gene MHC-II module — 2834, 307, 998 and 3466). FIS1 is therefore not a co-expression partner of the immune hubs. Its up-regulation in Mars1 (logFC +1.26, t = +17.2), which exceeds that of any hub gene, is most parsimoniously read as part of the same up-regulated heme/erythroid program identified above, most likely reflecting a reticulocyte/erythroid-precursor shift in whole blood rather than a mitophagy- or oxidative-stress-driven immune mechanism. FIS1 is accordingly reported as an erythroid-arm, prognostically significant gene co-selected with the immune axis, and is explicitly not treated as an immune hub or as a mechanistic target. It also passed all three ML selectors including the 28-day-death univariate test (S05_hub_genes.csv) and carries a significant independent univariate association with 28-day death (OR 1.34 per SD, 95% CI 1.08–1.66, p = 0.00735; S06_hub_death_association.csv), so it is reported as a genuine secondary erythroid-axis prognostic signal rather than a mere co-expression passenger. Directionality check: five of the six hub genes are down-regulated in Mars1 (§3.1); FIS1 is up-regulated (logFC +1.26, t = +17.2), so it is reported as an erythroid-arm marker rather than a member of the down-regulated immunosuppression axis. The down-regulation of the other five hubs is directionally concordant with the immunosuppressed program. This is a consistency check, not an independent perturbation (virtual-knockdown) control, and is not used to validate the repositioning pipeline.</w:t>
+        <w:t xml:space="preserve"> ]. Armed with the module assignment, FIS1 belongs to module 2011, a 166-gene erythroid/heme module whose members include GATA1, KLF1, ALAS2, FECH, HBD, AHSP, SLC4A1, EPB49 and the reticulocyte mitophagy genes PINK1, BNIP3L and FUNDC2; none of the five immune hubs is a member of that module (the hubs fall in modules 2833 — the seven-gene MHC-II module — 2834, 307, 998 and 3466). FIS1 is therefore not a co-expression partner of the immune hubs. Its up-regulation in Mars1 (logFC +1.26, t = +17.2), which exceeds that of any hub gene, is most parsimoniously read as part of the same up-regulated heme/erythroid program identified above, most likely reflecting a reticulocyte/erythroid-precursor shift in whole blood rather than a mitophagy- or oxidative-stress-driven immune mechanism. FIS1 is accordingly reported as an erythroid-arm, prognostically significant gene co-selected with the immune axis, and is explicitly not treated as an immune hub or as a mechanistic target. It also passed all three ML selectors including the 28-day-death univariate test (S05_hub_genes.csv); the univariate death association it carries (OR 1.34 per SD, 95% CI 1.08–1.66, p = 0.00735; S06_hub_death_association.csv) is the selection criterion restated rather than an independent confirmation, so FIS1 is reported as a co-selected erythroid-arm marker, not as an independently validated prognostic target. Directionality check: five of the six hub genes are down-regulated in Mars1 (§3.1); FIS1 is up-regulated (logFC +1.26, t = +17.2), so it is reported as an erythroid-arm marker rather than a member of the down-regulated immunosuppression axis. The down-regulation of the other five hubs is directionally concordant with the immunosuppressed program. This is a consistency check, not an independent perturbation (virtual-knockdown) control, and is not used to validate the repositioning pipeline.</w:t>
       </w:r>
     </w:p>
     <w:p>
@@ -2578,7 +2578,7 @@
           <w:b w:val="0"/>
           <w:i w:val="0"/>
         </w:rPr>
-        <w:t xml:space="preserve"> — an inner-loop estimate after fixed feature selection on the same 28-day labels (events-per-variable = 114/30 ≈ 3.8, well below the conventional ≥10 rule), and therefore optimistic. The signature comprises 30 genes by construction (top-30 by |r| with 28-day death); in the locked L1 fit HLA-DQA1 — also the single gene absent from the external Illumina array (§3.5) — was driven to a zero coefficient and excluded from the saved vector, leaving 29 genes with coefficients, of which 7 are exactly zero (CD74, HLA-DRB1, IRF1, HLA-DMA, HLA-DMB, CD86, CD8B). The external AUC 0.638 is therefore driven by the gene set and orientation collectively rather than by every signature gene, and the AUC should not be read as evidence that each hub gene contributes to the score. Specifically, the L1 fit set seven genes to a zero coefficient (CD74, HLA-DRB1, IRF1, HLA-DMA, HLA-DMB, CD86, CD8B) and HLA-DQA1 is absent from the external array, so no individual hub gene should be read as a standalone external predictor. Cross-validated and training ROC: [ , ]. Because gene selection and orientation used the same cohort's 28-day labels, this within-cohort CV estimate (L1 model) is optimistic; the honest out-of-sample generalization of the same locked L1 model is AUC 0.585 (95% CI 0.469–0.696), whose interval includes 0.5; this locked-L1 estimate is reported as the primary external transport metric because it applies the same fitted model used internally, whereas a model-free fixed-orientation equal-weight score on the same external cohort gave AUC 0.638 (95% CI 0.532–0.748) and is reported as a pre-specified sensitivity analysis (it carries no cohort-specific weights but also no cohort-specific learning); the two external metrics differ by 0.053 and the like-for-like transport loss for the L1 model is 0.074 AUC units. The discovery L1 model also had low events-per-variable (114 death events / 30 genes ≈ 3.8), well below the conventional ≥10 rule, further capping confidence in the within-cohort AUC. Relative to the IRG benchmark reported by Peng et al. [8] (0.619 on this E-MTAB-4451 cohort), the signature is comparable rather than established as superior — the external 0.638 falls within sampling noise of 0.619 (DeLong P ≈ 0.56, not significant) and within the signature's own 95% CI. A 3-gene IRG proxy recomputed here was 0.529 (a weak reference only — its CI overlaps the other benchmarks — because it lacks the full IRG gene set) and is reported only as a weak lower-bound reference, not as a competing benchmark; the published IRG benchmark was reported as a single point estimate without a confidence interval, so a formal difference test against it was not performed and the difference is not established as statistically meaningful. Calibration and decision-curve analytics [23] for the external equal-weight score are in Fig. S6C ( ): a logistic recalibration on the 106-patient external cohort (52 deaths) gave a calibration slope of 0.50 with intercept −0.04 (calibration-in-the-large adequate), meaning the score </w:t>
+        <w:t xml:space="preserve"> — an inner-loop estimate after fixed feature selection on the same 28-day labels (events-per-variable = 114/30 ≈ 3.8, well below the conventional ≥10 rule), and therefore optimistic. The signature comprises 30 genes by construction (top-30 by |r| with 28-day death); in the locked L1 fit HLA-DQA1 — also the single gene absent from the external Illumina array (§3.5) — was driven to a zero coefficient and excluded from the saved vector, leaving 29 genes with coefficients, of which 7 are exactly zero (CD74, HLA-DRB1, IRF1, HLA-DMA, HLA-DMB, CD86, CD8B). The external AUC 0.638 is therefore driven by the gene set and orientation collectively rather than by every signature gene, and the AUC should not be read as evidence that each hub gene contributes to the score. Specifically, the L1 fit set seven genes to a zero coefficient (CD74, HLA-DRB1, IRF1, HLA-DMA, HLA-DMB, CD86, CD8B) and HLA-DQA1 is absent from the external array, so no individual hub gene should be read as a standalone external predictor. Cross-validated and training ROC: [ , ]. Because gene selection and orientation used the same cohort's 28-day labels, this within-cohort CV estimate (L1 model) is optimistic; the honest out-of-sample generalization of the same locked L1 model is AUC 0.585 (95% CI 0.469–0.696), whose interval includes 0.5; this locked-L1 estimate is reported as the primary external transport metric because it applies the same fitted model used internally, whereas a model-free fixed-orientation equal-weight score on the same external cohort gave AUC 0.638 (95% CI 0.532–0.748) and is reported as a pre-specified sensitivity analysis (it carries no cohort-specific weights but also no cohort-specific learning); the two external metrics differ by 0.053 and the like-for-like transport loss for the L1 model is 0.074 AUC units. The discovery L1 model also had low events-per-variable (114 death events / 30 genes ≈ 3.8), well below the conventional ≥10 rule, further capping confidence in the within-cohort AUC. Relative to the IRG benchmark reported by Peng et al. [8] (0.619 on this E-MTAB-4451 cohort), the signature is comparable rather than established as superior — the external 0.638 falls within the signature's own 95% CI and is close to the published 0.619 point estimate, but the benchmark was reported as a single point estimate without a confidence interval or per-sample scores, so no formal difference test against it is possible and the comparison is descriptive. A 3-gene IRG proxy recomputed here was 0.529 (a weak reference only — its CI overlaps the other benchmarks — because it lacks the full IRG gene set) and is reported only as a weak lower-bound reference, not as a competing benchmark; on the same 106 samples the equal-weight score (0.638) is not statistically distinguishable from even this weak proxy (DeLong P = 0.16, also not significant), underscoring that the external performance is real but modest and not established as superior to simpler references. Calibration and decision-curve analytics [23] for the external equal-weight score are in Fig. S6C ( ): a logistic recalibration on the 106-patient external cohort (52 deaths) gave a calibration slope of 0.50 with intercept −0.04 (calibration-in-the-large adequate), meaning the score </w:t>
       </w:r>
       <w:r>
         <w:rPr>
@@ -4118,7 +4118,7 @@
           <w:b w:val="0"/>
           <w:i w:val="0"/>
         </w:rPr>
-        <w:t xml:space="preserve"> score (portable, no cohort-specific weights) reached AUC 0.638 (95% CI 0.532–0.748), whose point estimate is only 0.138 above chance and 0.019 above the published IRG benchmark (Peng et al. [8], 0.619 on this cohort), a difference that is not statistically significant (DeLong P ≈ 0.56). Generalization is therefore real but modest and uncertain: the honest primary claim is a real-but-modest, not-validated prognostic signal, not a test that beats chance or the benchmark. One signature gene (HLA-DQA1) was absent on the Illumina array. The within-cohort 5-fold CV AUC 0.659 is optimistic because gene selection and orientation used the same cohort's 28-day labels; the external AUCs are the honest generalization estimates. To place the portable equal-weight score in context we also benchmarked it inside the external cohort against comparators computable from the shipped metadata: the cohort's own published sepsis-response-signature endotype (SRS group, available for all 106 profiled samples) classified 28-day mortality at AUC 0.610 (SRS1 24/37, 64.9% mortality, versus SRS2 28/69, 40.6%), and age alone classified it at AUC 0.504. The equal-weight score therefore exceeds the existing transcriptomic endotype in these same patients by ≈0.03 AUC units (0.638 vs 0.610; ΔAUC +0.028, permutation P = 0.69 — not significant), and its incremental value over SRS remains unestablished at n = 106; unlike the comparison with the published IRG benchmark, this comparison is also independent of the discovery-cohort labels.</w:t>
+        <w:t xml:space="preserve"> score (portable, no cohort-specific weights) reached AUC 0.638 (95% CI 0.532–0.748), whose point estimate is only 0.138 above chance and 0.019 above the published IRG benchmark (Peng et al. [8], 0.619 on this cohort, reported without a confidence interval or per-sample scores), a difference for which no formal significance test is possible and which is therefore descriptive only. Generalization is therefore real but modest and uncertain: the honest primary claim is a real-but-modest, not-validated prognostic signal, not a test that beats chance or the benchmark. One signature gene (HLA-DQA1) was absent on the Illumina array. The within-cohort 5-fold CV AUC 0.659 is optimistic because gene selection and orientation used the same cohort's 28-day labels; the external AUCs are the honest generalization estimates. To place the portable equal-weight score in context we also benchmarked it inside the external cohort against comparators computable from the shipped metadata: the cohort's own published sepsis-response-signature endotype (SRS group, available for all 106 profiled samples) classified 28-day mortality at AUC 0.610 (SRS1 24/37, 64.9% mortality, versus SRS2 28/69, 40.6%), and age alone classified it at AUC 0.504. The equal-weight score therefore exceeds the existing transcriptomic endotype in these same patients by ≈0.03 AUC units (0.638 vs 0.610; ΔAUC +0.028, permutation P = 0.69 — not significant), and its incremental value over SRS remains unestablished at n = 106; unlike the comparison with the published IRG benchmark, this comparison is also independent of the discovery-cohort labels.</w:t>
       </w:r>
     </w:p>
     <w:p>
@@ -4853,7 +4853,7 @@
                 <w:i w:val="0"/>
                 <w:sz w:val="17"/>
               </w:rPr>
-              <w:t>6 co-expression-associated genes (5 immune hubs + FIS1 passenger)</w:t>
+              <w:t>6 co-expression-associated genes (5 immune hubs + FIS1 erythroid-module gene)</w:t>
             </w:r>
           </w:p>
         </w:tc>
@@ -5762,7 +5762,7 @@
           <w:b w:val="0"/>
           <w:i w:val="0"/>
         </w:rPr>
-        <w:t xml:space="preserve"> S01 — Mars1 differential expression and consensus immune-gene direction (Mars1-vs-Other and sepsis-vs-healthy). S02 — immune-function score by MARS endotype. S04 — curated immune-gene sets. S05 — hub-gene selection (LASSO / RF / univariate consensus) and the FIS1 co-expression passenger. S06 — 30-gene signature genes and cross-validated AUC. S07 — hub and axis cellular-context marker-module correlations. S08 — mechanism-anchored repositioning shortlist, positive-control check, and L1000 reverse-connectivity scores (candidates, full library, glucocorticoid caveat, immuno-overlap). S08b — clinical-translation status of each candidate. S09 — (deferred by design; see Limitation 7). S11 — experimental validation blueprint (LPS-tolerance / patient-cell assays).</w:t>
+        <w:t xml:space="preserve"> S01 — Mars1 differential expression and consensus immune-gene direction (Mars1-vs-Other and sepsis-vs-healthy). S02 — immune-function score by MARS endotype. S04 — curated immune-gene sets. S05 — hub-gene selection (LASSO / RF / univariate consensus) and the FIS1 erythroid-module gene. S06 — 30-gene signature genes and cross-validated AUC. S07 — hub and axis cellular-context marker-module correlations. S08 — mechanism-anchored repositioning shortlist, positive-control check, and L1000 reverse-connectivity scores (candidates, full library, glucocorticoid caveat, immuno-overlap). S08b — clinical-translation status of each candidate. S09 — (deferred by design; see Limitation 7). S11 — experimental validation blueprint (LPS-tolerance / patient-cell assays).</w:t>
       </w:r>
     </w:p>
     <w:p>
@@ -5810,7 +5810,7 @@
           <w:b w:val="0"/>
           <w:i w:val="0"/>
         </w:rPr>
-        <w:t xml:space="preserve">All result tables (03_results/) and analysis code are released under MIT in the versioned repository at https://github.com/yyx-4113/sepsis-immunoparalysis-hub. A citable versioned snapshot is provided as a GitHub release (tag v1.22.0); a Zenodo DOI (10.5281/zenodo.23042366) is deposited and public (the current evaluated commit 1212f7b is tagged v1.16.0, and this v1.22.0 release is built on top of it). The GSE65682 processed expression / phenotype matrix is regenerable from GEO (platform GPL13667) via the deposited processing scripts; E-MTAB-4451 is obtained as the published normalised matrix from ArrayExpress/BioStudies (platform GPL10558). The large raw inputs (~43 GB) are mirrored per DATA_SOURCES.md and are excluded from the repository for size. This study </w:t>
+        <w:t xml:space="preserve">All result tables (03_results/) and analysis code are released under MIT in the versioned repository at https://github.com/yyx-4113/sepsis-immunoparalysis-hub. A citable versioned snapshot is provided as a GitHub release (tag v1.23.0); a Zenodo DOI (10.5281/zenodo.23042366) is deposited and public (the current evaluated commit 1212f7b is tagged v1.16.0, and this v1.23.0 release is built on top of it). The GSE65682 processed expression / phenotype matrix is regenerable from GEO (platform GPL13667) via the deposited processing scripts; E-MTAB-4451 is obtained as the published normalised matrix from ArrayExpress/BioStudies (platform GPL10558). The large raw inputs (~43 GB) are mirrored per DATA_SOURCES.md and are excluded from the repository for size. This study </w:t>
       </w:r>
       <w:r>
         <w:rPr>
@@ -5853,7 +5853,7 @@
           <w:b w:val="0"/>
           <w:i w:val="0"/>
         </w:rPr>
-        <w:t>Analysis code is released under the MIT licence in the versioned repository at https://github.com/yyx-4113/sepsis-immunoparalysis-hub (citable GitHub release, tag v1.22.0; CITATION.cff included).</w:t>
+        <w:t>Analysis code is released under the MIT licence in the versioned repository at https://github.com/yyx-4113/sepsis-immunoparalysis-hub (citable GitHub release, tag v1.23.0; CITATION.cff included).</w:t>
       </w:r>
     </w:p>
     <w:p>

</xml_diff>

<commit_message>
Patch to v1.23.1 (close Round-21 loose ends): fix A1 Issue 3b (Conclusion FIS1 'co-segregates with erythroid/heme module, not immune hub'), A2 Issue 4 (title 'prognostic' / abstract 'immune-risk' wording cross-reference), A4 Issues 1-2 (manifest title word count 24; explicit non-contiguous Fig.S list S1/S2/S3A-B/S6A-C/S7/S9/S10 in build template); rebuild docx + regenerated manifest/checklist; bump CITATION.cff to 1.23.1
</commit_message>
<xml_diff>
--- a/07_submission_bmc_v1.21.0/Manuscript.docx
+++ b/07_submission_bmc_v1.21.0/Manuscript.docx
@@ -2562,7 +2562,7 @@
           <w:b w:val="0"/>
           <w:i w:val="0"/>
         </w:rPr>
-        <w:t xml:space="preserve">The signature is dominated by antigen-presentation (HLA-DRA/DRB1/DMA/DMB/DQA1), monocytic (CD14, FCGR3A, LYZ, ITGAM, MARCO) and T-cell (CD3D/E/G, CD8A/B, IL7R) genes, almost all negatively correlated with death. Although this antigen-presentation/monocytic core dominates, the signature also contains a neutrophilic/acute-phase arm (ELANE, MPO, S100A8) that correlates positively with death, so it is best described as a generalized 28-day-mortality / immune-risk signature enriched for the Mars1 antigen-presentation program rather than an immunoparalysis-specific signature; the title's "prognostic / immune-risk" wording should be read accordingly. It achieved a </w:t>
+        <w:t xml:space="preserve">The signature is dominated by antigen-presentation (HLA-DRA/DRB1/DMA/DMB/DQA1), monocytic (CD14, FCGR3A, LYZ, ITGAM, MARCO) and T-cell (CD3D/E/G, CD8A/B, IL7R) genes, almost all negatively correlated with death. Although this antigen-presentation/monocytic core dominates, the signature also contains a neutrophilic/acute-phase arm (ELANE, MPO, S100A8) that correlates positively with death, so it is best described as a generalized 28-day-mortality / immune-risk signature enriched for the Mars1 antigen-presentation program rather than an immunoparalysis-specific signature; the title's "prognostic" and the abstract's "immune-risk" wording should be read accordingly. It achieved a </w:t>
       </w:r>
       <w:r>
         <w:rPr>
@@ -4483,7 +4483,7 @@
           <w:b w:val="0"/>
           <w:i w:val="0"/>
         </w:rPr>
-        <w:t>The Mars1 immunosuppressed program is anchored by five antigen-presentation/monocytic hub genes (CD74, HLA-DQA1, CD14, FCGR3A) plus the co-inhibitory checkpoint HAVCR2/TIM-3 (expressed on T cells and antigen-presenting cells) — with a sixth co-expression-linked gene, FIS1, a mitochondrial-fission protein up-regulated in Mars1 (logFC +1.26) that lies outside the immune set and is reported as an erythroid-module gene rather than an immune hub (§3.3) — that are both prognostically associated (within-cohort CV-AUC 0.659, optimistic; honest external transport AUC 0.585 for the locked L1 model, with an equal-weight sensitivity of 0.638 on E-MTAB-4451) and identify candidate, expression-level intervention hypotheses (direct-target validation still pending). In-silico repositioning annotates IL-7, GM-CSF and IFN-γ as hypothesis-generating axis-specific immune-restorative candidates; their small-molecule counterparts lenalidomide and azithromycin show directional-but-modest LINCS L1000 rescue of the Mars1-down axis; because the same axis ranks prednisone in the 3.2nd percentile, that ranking is descriptive only and not supportive evidence, and functional validation (S11) remains required.</w:t>
+        <w:t>The Mars1 immunosuppressed program is anchored by five antigen-presentation/monocytic hub genes (CD74, HLA-DQA1, CD14, FCGR3A) plus the co-inhibitory checkpoint HAVCR2/TIM-3 (expressed on T cells and antigen-presenting cells) — with a sixth co-expression-linked gene, FIS1, a mitochondrial-fission protein up-regulated in Mars1 (logFC +1.26) that lies outside the immune set and co-segregates with the erythroid/heme co-expression module rather than being an immune hub (§3.3) — that are both prognostically associated (within-cohort CV-AUC 0.659, optimistic; honest external transport AUC 0.585 for the locked L1 model, with an equal-weight sensitivity of 0.638 on E-MTAB-4451) and identify candidate, expression-level intervention hypotheses (direct-target validation still pending). In-silico repositioning annotates IL-7, GM-CSF and IFN-γ as hypothesis-generating axis-specific immune-restorative candidates; their small-molecule counterparts lenalidomide and azithromycin show directional-but-modest LINCS L1000 rescue of the Mars1-down axis; because the same axis ranks prednisone in the 3.2nd percentile, that ranking is descriptive only and not supportive evidence, and functional validation (S11) remains required.</w:t>
       </w:r>
     </w:p>
     <w:p>
@@ -5810,7 +5810,7 @@
           <w:b w:val="0"/>
           <w:i w:val="0"/>
         </w:rPr>
-        <w:t xml:space="preserve">All result tables (03_results/) and analysis code are released under MIT in the versioned repository at https://github.com/yyx-4113/sepsis-immunoparalysis-hub. A citable versioned snapshot is provided as a GitHub release (tag v1.23.0); a Zenodo DOI (10.5281/zenodo.23042366) is deposited and public (the current evaluated commit 1212f7b is tagged v1.16.0, and this v1.23.0 release is built on top of it). The GSE65682 processed expression / phenotype matrix is regenerable from GEO (platform GPL13667) via the deposited processing scripts; E-MTAB-4451 is obtained as the published normalised matrix from ArrayExpress/BioStudies (platform GPL10558). The large raw inputs (~43 GB) are mirrored per DATA_SOURCES.md and are excluded from the repository for size. This study </w:t>
+        <w:t xml:space="preserve">All result tables (03_results/) and analysis code are released under MIT in the versioned repository at https://github.com/yyx-4113/sepsis-immunoparalysis-hub. A citable versioned snapshot is provided as a GitHub release (tag v1.23.1); a Zenodo DOI (10.5281/zenodo.23042366) is deposited and public (the current evaluated commit 1212f7b is tagged v1.16.0, and this v1.23.1 release is built on top of it). The GSE65682 processed expression / phenotype matrix is regenerable from GEO (platform GPL13667) via the deposited processing scripts; E-MTAB-4451 is obtained as the published normalised matrix from ArrayExpress/BioStudies (platform GPL10558). The large raw inputs (~43 GB) are mirrored per DATA_SOURCES.md and are excluded from the repository for size. This study </w:t>
       </w:r>
       <w:r>
         <w:rPr>
@@ -5853,7 +5853,7 @@
           <w:b w:val="0"/>
           <w:i w:val="0"/>
         </w:rPr>
-        <w:t>Analysis code is released under the MIT licence in the versioned repository at https://github.com/yyx-4113/sepsis-immunoparalysis-hub (citable GitHub release, tag v1.23.0; CITATION.cff included).</w:t>
+        <w:t>Analysis code is released under the MIT licence in the versioned repository at https://github.com/yyx-4113/sepsis-immunoparalysis-hub (citable GitHub release, tag v1.23.1; CITATION.cff included).</w:t>
       </w:r>
     </w:p>
     <w:p>

</xml_diff>

<commit_message>
Revise to v1.24.0 (Round-22 graded fixes): Tier-1 - extend _ext_calibration_dca.py to emit bootstrap SE/CI + P(slope=1) so 09_ext_calibration_dca.csv is fully reproducible (16 cols, no undocumented columns); remove S10 MR documentation from README; fix CITATION.cff + author_verification_statement.md title/tag mismatches (now v1.24.0); emit proper Keywords line in Manuscript.docx. Tier-2 - add primary 'not significantly above chance' caveat to unstructured abstract; soften Conclusion FIS1 'mitochondrial-fission protein' to erythroid/heme-module gene; disarm 'immune-annotated' ML-consensus + 'rather than mitophagy' self-contradiction in S3.3; harmonize provenance commits (1212f7b v1.16.0 base, 7704c9a v1.20.0 MR removal). Rebuild docx; verify + audit green pending tag
</commit_message>
<xml_diff>
--- a/07_submission_bmc_v1.21.0/Manuscript.docx
+++ b/07_submission_bmc_v1.21.0/Manuscript.docx
@@ -2503,7 +2503,7 @@
           <w:b w:val="0"/>
           <w:i w:val="0"/>
         </w:rPr>
-        <w:t>The tri-method ML consensus identified five immune hub genes anchored in the antigen-presentation/monocytic program (CD74, HLA-DQA1, CD14, FCGR3A) plus the co-inhibitory checkpoint HAVCR2/TIM-3 (expressed on T cells and antigen-presenting cells), and one non-immune, erythroid/heme-module gene, FIS1 — a mitochondrial-fission protein (Yoon et al. [22]) — (which entered the candidate pool through the top-20 degree-centrality branch of §2.5, where it ranked 12th, rather than through the immune-annotated branch). Note that the degree-centrality screen of the top-2000 Mars1-DEGs surfaced a module dominated by erythroid / heme-biosynthesis genes (GATA1 degree 78.4, CGB 76.1, EPB49 72.5; FIS1 ranked 12th), consistent with the up-regulated heme program previously reported in Mars1; the five immune hubs plus FIS1 — an erythroid-module gene co-selected with the immune hubs — were therefore carried by the tri-method ML consensus (which selects on 28-day-survival-associated, immune-annotated genes) rather than by the co-expression network alone [</w:t>
+        <w:t>The tri-method ML consensus identified five immune hub genes anchored in the antigen-presentation/monocytic program (CD74, HLA-DQA1, CD14, FCGR3A) plus the co-inhibitory checkpoint HAVCR2/TIM-3 (expressed on T cells and antigen-presenting cells), and one non-immune, erythroid/heme-module gene, FIS1 — a mitochondrial-fission protein (Yoon et al. [22]) — (which entered the candidate pool through the top-20 degree-centrality branch of §2.5, where it ranked 12th, rather than through the immune-annotated branch). Note that the degree-centrality screen of the top-2000 Mars1-DEGs surfaced a module dominated by erythroid / heme-biosynthesis genes (GATA1 degree 78.4, CGB 76.1, EPB49 72.5; FIS1 ranked 12th), consistent with the up-regulated heme program previously reported in Mars1; the five immune hubs plus FIS1 — an erythroid-module gene co-selected with the immune hubs — were therefore carried by the tri-method ML consensus (which selects on 28-day-survival-associated genes, most of them immune-annotated) rather than by the co-expression network alone [</w:t>
       </w:r>
       <w:r>
         <w:rPr>
@@ -2535,7 +2535,7 @@
           <w:b w:val="0"/>
           <w:i w:val="0"/>
         </w:rPr>
-        <w:t xml:space="preserve"> ]. Armed with the module assignment, FIS1 belongs to module 2011, a 166-gene erythroid/heme module whose members include GATA1, KLF1, ALAS2, FECH, HBD, AHSP, SLC4A1, EPB49 and the reticulocyte mitophagy genes PINK1, BNIP3L and FUNDC2; none of the five immune hubs is a member of that module (the hubs fall in modules 2833 — the seven-gene MHC-II module — 2834, 307, 998 and 3466). FIS1 is therefore not a co-expression partner of the immune hubs. Its up-regulation in Mars1 (logFC +1.26, t = +17.2), which exceeds that of any hub gene, is most parsimoniously read as part of the same up-regulated heme/erythroid program identified above, most likely reflecting a reticulocyte/erythroid-precursor shift in whole blood rather than a mitophagy- or oxidative-stress-driven immune mechanism. FIS1 is accordingly reported as an erythroid-arm, prognostically significant gene co-selected with the immune axis, and is explicitly not treated as an immune hub or as a mechanistic target. It also passed all three ML selectors including the 28-day-death univariate test (S05_hub_genes.csv); the univariate death association it carries (OR 1.34 per SD, 95% CI 1.08–1.66, p = 0.00735; S06_hub_death_association.csv) is the selection criterion restated rather than an independent confirmation, so FIS1 is reported as a co-selected erythroid-arm marker, not as an independently validated prognostic target. Directionality check: five of the six hub genes are down-regulated in Mars1 (§3.1); FIS1 is up-regulated (logFC +1.26, t = +17.2), so it is reported as an erythroid-arm marker rather than a member of the down-regulated immunosuppression axis. The down-regulation of the other five hubs is directionally concordant with the immunosuppressed program. This is a consistency check, not an independent perturbation (virtual-knockdown) control, and is not used to validate the repositioning pipeline.</w:t>
+        <w:t xml:space="preserve"> ]. Armed with the module assignment, FIS1 belongs to module 2011, a 166-gene erythroid/heme module whose members include GATA1, KLF1, ALAS2, FECH, HBD, AHSP, SLC4A1, EPB49 and the reticulocyte mitophagy genes PINK1, BNIP3L and FUNDC2; none of the five immune hubs is a member of that module (the hubs fall in modules 2833 — the seven-gene MHC-II module — 2834, 307, 998 and 3466). FIS1 is therefore not a co-expression partner of the immune hubs. Its up-regulation in Mars1 (logFC +1.26, t = +17.2), which exceeds that of any hub gene, is most parsimoniously read as part of the same up-regulated heme/erythroid program identified above, most likely reflecting a reticulocyte/erythroid-precursor shift in whole blood; the mitophagy genes PINK1 and BNIP3L co-cluster with FIS1 in the same erythroid/heme module (module 2011), so the signal is best read as an erythroid-program correlate rather than a mitophagy- or oxidative-stress-driven immune mechanism. FIS1 is accordingly reported as an erythroid-arm, prognostically significant gene co-selected with the immune axis, and is explicitly not treated as an immune hub or as a mechanistic target. It also passed all three ML selectors including the 28-day-death univariate test (S05_hub_genes.csv); the univariate death association it carries (OR 1.34 per SD, 95% CI 1.08–1.66, p = 0.00735; S06_hub_death_association.csv) is the selection criterion restated rather than an independent confirmation, so FIS1 is reported as a co-selected erythroid-arm marker, not as an independently validated prognostic target. Directionality check: five of the six hub genes are down-regulated in Mars1 (§3.1); FIS1 is up-regulated (logFC +1.26, t = +17.2), so it is reported as an erythroid-arm marker rather than a member of the down-regulated immunosuppression axis. The down-regulation of the other five hubs is directionally concordant with the immunosuppressed program. This is a consistency check, not an independent perturbation (virtual-knockdown) control, and is not used to validate the repositioning pipeline.</w:t>
       </w:r>
     </w:p>
     <w:p>
@@ -2669,7 +2669,7 @@
           <w:b w:val="0"/>
           <w:i w:val="0"/>
         </w:rPr>
-        <w:t xml:space="preserve">, not the cohort-specific learned weights, are the portable component; a model-free fixed-orientation equal-weight score (a pre-specified sensitivity) reached AUC 0.638 (95% CI 0.532–0.748), a modest separation (the 95% CI excludes 0.5, though the point estimate is only 0.138 above chance and the lower bound is close to 0.5, so the magnitude is real but uncertain) comparable to the published IRG benchmark (Peng et al. [8] reported 0.619 on this cohort); a 3-gene IRG proxy recomputed here was 0.529 (a weak reference only; its confidence interval overlaps the other benchmarks, so the comparison is descriptive). Thus the immune-risk signature generalizes across platforms and populations at a level comparable to published sepsis mortality signatures, with magnitude that is real but modest. The external test set carries only 52 death events for a 30-gene signature (effective events-per-variable ≈ 1.7), so the AUC point estimates are imprecise; the wide 95% CIs (0.469–0.696 and 0.532–0.748) reflect this small-event constraint, and the point estimates should not be over-read. Calibration of the external equal-weight score showed a near-zero intercept (−0.04, 95% CI −0.43 to 0.35) but a sub-ideal slope of 0.50 (95% CI 0.10 to 0.91; P = 0.016 against the ideal slope of 1.0), indicating over-confident predicted probabilities whose degree of over-confidence is only weakly identified at n = 106 with 52 events; the score is therefore presented as a risk </w:t>
+        <w:t xml:space="preserve">, not the cohort-specific learned weights, are the portable component; a model-free fixed-orientation equal-weight score (a pre-specified sensitivity) reached AUC 0.638 (95% CI 0.532–0.748), a modest separation (the 95% CI excludes 0.5, though the point estimate is only 0.138 above chance and the lower bound is close to 0.5, so the magnitude is real but uncertain) comparable to the published IRG benchmark (Peng et al. [8] reported 0.619 on this cohort); a 3-gene IRG proxy recomputed here was 0.529 (a weak reference only; its confidence interval overlaps the other benchmarks, so the comparison is descriptive). Thus the immune-risk signature generalizes across platforms and populations at a level comparable to published sepsis mortality signatures, with magnitude that is real but modest. The external test set carries only 52 death events for a 30-gene signature (effective events-per-variable ≈ 1.7), so the AUC point estimates are imprecise; the wide 95% CIs (0.469–0.696 and 0.532–0.748) reflect this small-event constraint, and the point estimates should not be over-read. Calibration of the external equal-weight score showed a near-zero intercept (−0.04, 95% CI −0.46 to 0.36, bootstrap percentile) but a sub-ideal slope of 0.50 (95% CI 0.10 to 0.93; P = 0.016 against the ideal slope of 1.0), indicating over-confident predicted probabilities whose degree of over-confidence is only weakly identified at n = 106 with 52 events; the score is therefore presented as a risk </w:t>
       </w:r>
       <w:r>
         <w:rPr>
@@ -4483,7 +4483,7 @@
           <w:b w:val="0"/>
           <w:i w:val="0"/>
         </w:rPr>
-        <w:t>The Mars1 immunosuppressed program is anchored by five antigen-presentation/monocytic hub genes (CD74, HLA-DQA1, CD14, FCGR3A) plus the co-inhibitory checkpoint HAVCR2/TIM-3 (expressed on T cells and antigen-presenting cells) — with a sixth co-expression-linked gene, FIS1, a mitochondrial-fission protein up-regulated in Mars1 (logFC +1.26) that lies outside the immune set and co-segregates with the erythroid/heme co-expression module rather than being an immune hub (§3.3) — that are both prognostically associated (within-cohort CV-AUC 0.659, optimistic; honest external transport AUC 0.585 for the locked L1 model, with an equal-weight sensitivity of 0.638 on E-MTAB-4451) and identify candidate, expression-level intervention hypotheses (direct-target validation still pending). In-silico repositioning annotates IL-7, GM-CSF and IFN-γ as hypothesis-generating axis-specific immune-restorative candidates; their small-molecule counterparts lenalidomide and azithromycin show directional-but-modest LINCS L1000 rescue of the Mars1-down axis; because the same axis ranks prednisone in the 3.2nd percentile, that ranking is descriptive only and not supportive evidence, and functional validation (S11) remains required.</w:t>
+        <w:t>The Mars1 immunosuppressed program is anchored by five antigen-presentation/monocytic hub genes (CD74, HLA-DQA1, CD14, FCGR3A) plus the co-inhibitory checkpoint HAVCR2/TIM-3 (expressed on T cells and antigen-presenting cells) — with a sixth co-expression-linked gene, FIS1, a non-immune erythroid/heme-module gene up-regulated in Mars1 (logFC +1.26) that lies outside the immune set and co-segregates with the erythroid/heme co-expression module rather than being an immune hub (§3.3) — that are both prognostically associated (within-cohort CV-AUC 0.659, optimistic; honest external transport AUC 0.585 for the locked L1 model, with an equal-weight sensitivity of 0.638 on E-MTAB-4451) and identify candidate, expression-level intervention hypotheses (direct-target validation still pending). In-silico repositioning annotates IL-7, GM-CSF and IFN-γ as hypothesis-generating axis-specific immune-restorative candidates; their small-molecule counterparts lenalidomide and azithromycin show directional-but-modest LINCS L1000 rescue of the Mars1-down axis; because the same axis ranks prednisone in the 3.2nd percentile, that ranking is descriptive only and not supportive evidence, and functional validation (S11) remains required.</w:t>
       </w:r>
     </w:p>
     <w:p>
@@ -5810,7 +5810,7 @@
           <w:b w:val="0"/>
           <w:i w:val="0"/>
         </w:rPr>
-        <w:t xml:space="preserve">All result tables (03_results/) and analysis code are released under MIT in the versioned repository at https://github.com/yyx-4113/sepsis-immunoparalysis-hub. A citable versioned snapshot is provided as a GitHub release (tag v1.23.1); a Zenodo DOI (10.5281/zenodo.23042366) is deposited and public (the current evaluated commit 1212f7b is tagged v1.16.0, and this v1.23.1 release is built on top of it). The GSE65682 processed expression / phenotype matrix is regenerable from GEO (platform GPL13667) via the deposited processing scripts; E-MTAB-4451 is obtained as the published normalised matrix from ArrayExpress/BioStudies (platform GPL10558). The large raw inputs (~43 GB) are mirrored per DATA_SOURCES.md and are excluded from the repository for size. This study </w:t>
+        <w:t xml:space="preserve">All result tables (03_results/) and analysis code are released under MIT in the versioned repository at https://github.com/yyx-4113/sepsis-immunoparalysis-hub. A citable versioned snapshot is provided as a GitHub release (tag v1.24.0); a Zenodo DOI (10.5281/zenodo.23042366) is deposited and public. The current evaluated commit 1212f7b is tagged v1.16.0 (the results-pinned base); the MR layer was removed at commit 7704c9a (v1.20.0), which sits above it; this v1.24.0 release is built on top of both. The GSE65682 processed expression / phenotype matrix is regenerable from GEO (platform GPL13667) via the deposited processing scripts; E-MTAB-4451 is obtained as the published normalised matrix from ArrayExpress/BioStudies (platform GPL10558). The large raw inputs (~43 GB) are mirrored per DATA_SOURCES.md and are excluded from the repository for size. This study </w:t>
       </w:r>
       <w:r>
         <w:rPr>
@@ -5853,7 +5853,7 @@
           <w:b w:val="0"/>
           <w:i w:val="0"/>
         </w:rPr>
-        <w:t>Analysis code is released under the MIT licence in the versioned repository at https://github.com/yyx-4113/sepsis-immunoparalysis-hub (citable GitHub release, tag v1.23.1; CITATION.cff included).</w:t>
+        <w:t>Analysis code is released under the MIT licence in the versioned repository at https://github.com/yyx-4113/sepsis-immunoparalysis-hub (citable GitHub release, tag v1.24.0; CITATION.cff included).</w:t>
       </w:r>
     </w:p>
     <w:p>

</xml_diff>